<commit_message>
Adding updated Case Diagram to the System Analysis Document and Diagrams
</commit_message>
<xml_diff>
--- a/docs/System Analysis/Apex Systems System Analysis Filled.docx
+++ b/docs/System Analysis/Apex Systems System Analysis Filled.docx
@@ -149,14 +149,7 @@
                 <w:rFonts w:ascii="Aptos" w:hAnsi="Aptos"/>
                 <w:sz w:val="17"/>
               </w:rPr>
-              <w:t xml:space="preserve">Public healthcare facility </w:t>
-            </w:r>
-            <w:r>
-              <w:rPr>
-                <w:rFonts w:ascii="Aptos" w:hAnsi="Aptos"/>
-                <w:sz w:val="17"/>
-              </w:rPr>
-              <w:t>(proposed client)</w:t>
+              <w:t>Public healthcare facility (proposed client)</w:t>
             </w:r>
           </w:p>
         </w:tc>
@@ -616,10 +609,7 @@
     </w:p>
     <w:p>
       <w:r>
-        <w:t xml:space="preserve">Apex is a proposed Windows-based desktop information system for public </w:t>
-      </w:r>
-      <w:r>
-        <w:t>healthcare facilities. It digitises patient registration, queue management and patient records so that staff can manage patient flow more efficiently. Patients are registered and assigned queue numbers; staff can monitor waiting times, call patients and flag priority or emergency cases. Digital records and persistent visit histories can be searched by name or ID number. The system is designed for offline operation using C# Windows Forms and a local database.</w:t>
+        <w:t>Apex is a proposed Windows-based desktop information system for public healthcare facilities. It digitises patient registration, queue management and patient records so that staff can manage patient flow more efficiently. Patients are registered and assigned queue numbers; staff can monitor waiting times, call patients and flag priority or emergency cases. Digital records and persistent visit histories can be searched by name or ID number. The system is designed for offline operation using C# Windows Forms and a local database.</w:t>
       </w:r>
     </w:p>
     <w:p>
@@ -727,14 +717,7 @@
                 <w:rFonts w:ascii="Aptos" w:hAnsi="Aptos"/>
                 <w:sz w:val="17"/>
               </w:rPr>
-              <w:t xml:space="preserve">The proposal specifies C# Windows Forms, a local database and offline </w:t>
-            </w:r>
-            <w:r>
-              <w:rPr>
-                <w:rFonts w:ascii="Aptos" w:hAnsi="Aptos"/>
-                <w:sz w:val="17"/>
-              </w:rPr>
-              <w:t>operation.</w:t>
+              <w:t>The proposal specifies C# Windows Forms, a local database and offline operation.</w:t>
             </w:r>
           </w:p>
         </w:tc>
@@ -813,14 +796,7 @@
                 <w:rFonts w:ascii="Aptos" w:hAnsi="Aptos"/>
                 <w:sz w:val="17"/>
               </w:rPr>
-              <w:t xml:space="preserve">Separate </w:t>
-            </w:r>
-            <w:r>
-              <w:rPr>
-                <w:rFonts w:ascii="Aptos" w:hAnsi="Aptos"/>
-                <w:sz w:val="17"/>
-              </w:rPr>
-              <w:t>included and excluded functions</w:t>
+              <w:t>Separate included and excluded functions</w:t>
             </w:r>
           </w:p>
         </w:tc>
@@ -927,13 +903,7 @@
         <w:rPr>
           <w:sz w:val="20"/>
         </w:rPr>
-        <w:t>Current process: (1) patient arrives; (2) receptionist captures or checks information using paper forms/registers; (3) a physical file is located or created; (4) patient waits while the queue is managed manually; (5) staff call patients without a central queue dashboard; (6) nurse/clinician retrieves the physical record and provides service; (7) visit information is recorded in the file; (8) the file is stored again. The proposal identifies slow access, lost files, inconsistent records and lack of reporting</w:t>
-      </w:r>
-      <w:r>
-        <w:rPr>
-          <w:sz w:val="20"/>
-        </w:rPr>
-        <w:t xml:space="preserve"> as limitations.</w:t>
+        <w:t>Current process: (1) patient arrives; (2) receptionist captures or checks information using paper forms/registers; (3) a physical file is located or created; (4) patient waits while the queue is managed manually; (5) staff call patients without a central queue dashboard; (6) nurse/clinician retrieves the physical record and provides service; (7) visit information is recorded in the file; (8) the file is stored again. The proposal identifies slow access, lost files, inconsistent records and lack of reporting as limitations.</w:t>
       </w:r>
     </w:p>
     <w:p/>
@@ -1050,14 +1020,7 @@
                 <w:rFonts w:ascii="Aptos" w:hAnsi="Aptos"/>
                 <w:sz w:val="17"/>
               </w:rPr>
-              <w:t xml:space="preserve">Creates a </w:t>
-            </w:r>
-            <w:r>
-              <w:rPr>
-                <w:rFonts w:ascii="Aptos" w:hAnsi="Aptos"/>
-                <w:sz w:val="17"/>
-              </w:rPr>
-              <w:t>consistent digital patient profile and reduces repeated manual capture.</w:t>
+              <w:t>Creates a consistent digital patient profile and reduces repeated manual capture.</w:t>
             </w:r>
           </w:p>
         </w:tc>
@@ -1245,14 +1208,7 @@
                 <w:rFonts w:ascii="Aptos" w:hAnsi="Aptos"/>
                 <w:sz w:val="17"/>
               </w:rPr>
-              <w:t xml:space="preserve">Supports management review of patient volumes and facility </w:t>
-            </w:r>
-            <w:r>
-              <w:rPr>
-                <w:rFonts w:ascii="Aptos" w:hAnsi="Aptos"/>
-                <w:sz w:val="17"/>
-              </w:rPr>
-              <w:t>operations.</w:t>
+              <w:t>Supports management review of patient volumes and facility operations.</w:t>
             </w:r>
           </w:p>
         </w:tc>
@@ -1334,6 +1290,7 @@
                 <w:rFonts w:ascii="Aptos" w:hAnsi="Aptos"/>
                 <w:sz w:val="17"/>
               </w:rPr>
+              <w:lastRenderedPageBreak/>
               <w:t>1</w:t>
             </w:r>
           </w:p>
@@ -1364,15 +1321,7 @@
                 <w:rFonts w:ascii="Aptos" w:hAnsi="Aptos"/>
                 <w:sz w:val="17"/>
               </w:rPr>
-              <w:t xml:space="preserve">The proposal specifies offline operation and excludes </w:t>
-            </w:r>
-            <w:r>
-              <w:rPr>
-                <w:rFonts w:ascii="Aptos" w:hAnsi="Aptos"/>
-                <w:sz w:val="17"/>
-              </w:rPr>
-              <w:lastRenderedPageBreak/>
-              <w:t>online/cloud functionality.</w:t>
+              <w:t>The proposal specifies offline operation and excludes online/cloud functionality.</w:t>
             </w:r>
           </w:p>
         </w:tc>
@@ -1389,7 +1338,6 @@
                 <w:rFonts w:ascii="Aptos" w:hAnsi="Aptos"/>
                 <w:sz w:val="17"/>
               </w:rPr>
-              <w:lastRenderedPageBreak/>
               <w:t>2</w:t>
             </w:r>
           </w:p>
@@ -1482,13 +1430,7 @@
         <w:rPr>
           <w:sz w:val="20"/>
         </w:rPr>
-        <w:t xml:space="preserve">System boundary: Apex covers local patient registration, queue assignment and </w:t>
-      </w:r>
-      <w:r>
-        <w:rPr>
-          <w:sz w:val="20"/>
-        </w:rPr>
-        <w:t>monitoring, priority/emergency flagging, digital record search and updates, visit history, basic operational reporting and local backup. External systems, internet/cloud services, mobile applications and national health database integrations are outside the boundary. The system is intended to operate on a local Windows environment with a local database.</w:t>
+        <w:t>System boundary: Apex covers local patient registration, queue assignment and monitoring, priority/emergency flagging, digital record search and updates, visit history, basic operational reporting and local backup. External systems, internet/cloud services, mobile applications and national health database integrations are outside the boundary. The system is intended to operate on a local Windows environment with a local database.</w:t>
       </w:r>
     </w:p>
     <w:p/>
@@ -1721,14 +1663,7 @@
                 <w:rFonts w:ascii="Aptos" w:hAnsi="Aptos"/>
                 <w:sz w:val="17"/>
               </w:rPr>
-              <w:t xml:space="preserve">Patient care and </w:t>
-            </w:r>
-            <w:r>
-              <w:rPr>
-                <w:rFonts w:ascii="Aptos" w:hAnsi="Aptos"/>
-                <w:sz w:val="17"/>
-              </w:rPr>
-              <w:t>record updates</w:t>
+              <w:t>Patient care and record updates</w:t>
             </w:r>
           </w:p>
         </w:tc>
@@ -2024,14 +1959,7 @@
                 <w:rFonts w:ascii="Aptos" w:hAnsi="Aptos"/>
                 <w:sz w:val="17"/>
               </w:rPr>
-              <w:t xml:space="preserve">Operational </w:t>
-            </w:r>
-            <w:r>
-              <w:rPr>
-                <w:rFonts w:ascii="Aptos" w:hAnsi="Aptos"/>
-                <w:sz w:val="17"/>
-              </w:rPr>
-              <w:t>reports and reliable statistics</w:t>
+              <w:t>Operational reports and reliable statistics</w:t>
             </w:r>
           </w:p>
         </w:tc>
@@ -2578,14 +2506,7 @@
                 <w:rFonts w:ascii="Aptos" w:hAnsi="Aptos"/>
                 <w:sz w:val="17"/>
               </w:rPr>
-              <w:t xml:space="preserve">The system must </w:t>
-            </w:r>
-            <w:r>
-              <w:rPr>
-                <w:rFonts w:ascii="Aptos" w:hAnsi="Aptos"/>
-                <w:sz w:val="17"/>
-              </w:rPr>
-              <w:t>display a live queue dashboard with waiting-time tracking.</w:t>
+              <w:t>The system must display a live queue dashboard with waiting-time tracking.</w:t>
             </w:r>
           </w:p>
         </w:tc>
@@ -2895,14 +2816,7 @@
                 <w:rFonts w:ascii="Aptos" w:hAnsi="Aptos"/>
                 <w:sz w:val="17"/>
               </w:rPr>
-              <w:t xml:space="preserve">The </w:t>
-            </w:r>
-            <w:r>
-              <w:rPr>
-                <w:rFonts w:ascii="Aptos" w:hAnsi="Aptos"/>
-                <w:sz w:val="17"/>
-              </w:rPr>
-              <w:t>system must generate administrative and operational reports.</w:t>
+              <w:t>The system must generate administrative and operational reports.</w:t>
             </w:r>
           </w:p>
         </w:tc>
@@ -3559,14 +3473,7 @@
                 <w:rFonts w:ascii="Aptos" w:hAnsi="Aptos"/>
                 <w:sz w:val="17"/>
               </w:rPr>
-              <w:t xml:space="preserve">Only authorised staff may access patient records and </w:t>
-            </w:r>
-            <w:r>
-              <w:rPr>
-                <w:rFonts w:ascii="Aptos" w:hAnsi="Aptos"/>
-                <w:sz w:val="17"/>
-              </w:rPr>
-              <w:t>system functions.</w:t>
+              <w:t>Only authorised staff may access patient records and system functions.</w:t>
             </w:r>
           </w:p>
         </w:tc>
@@ -3752,14 +3659,7 @@
                 <w:rFonts w:ascii="Aptos" w:hAnsi="Aptos"/>
                 <w:sz w:val="17"/>
               </w:rPr>
-              <w:t xml:space="preserve">A </w:t>
-            </w:r>
-            <w:r>
-              <w:rPr>
-                <w:rFonts w:ascii="Aptos" w:hAnsi="Aptos"/>
-                <w:sz w:val="17"/>
-              </w:rPr>
-              <w:t>patient record must retain its visit history rather than being recreated for every visit.</w:t>
+              <w:t>A patient record must retain its visit history rather than being recreated for every visit.</w:t>
             </w:r>
           </w:p>
         </w:tc>
@@ -3883,14 +3783,7 @@
                 <w:rFonts w:ascii="Aptos" w:hAnsi="Aptos"/>
                 <w:sz w:val="17"/>
               </w:rPr>
-              <w:t xml:space="preserve">Operational reports must use stored </w:t>
-            </w:r>
-            <w:r>
-              <w:rPr>
-                <w:rFonts w:ascii="Aptos" w:hAnsi="Aptos"/>
-                <w:sz w:val="17"/>
-              </w:rPr>
-              <w:t>queue/patient information.</w:t>
+              <w:t>Operational reports must use stored queue/patient information.</w:t>
             </w:r>
           </w:p>
         </w:tc>
@@ -3926,7 +3819,11 @@
         </w:tc>
       </w:tr>
     </w:tbl>
-    <w:p/>
+    <w:p>
+      <w:pPr>
+        <w:pStyle w:val="Heading1"/>
+      </w:pPr>
+    </w:p>
     <w:p>
       <w:pPr>
         <w:pStyle w:val="Heading1"/>
@@ -3956,10 +3853,18 @@
           <w:noProof/>
         </w:rPr>
         <w:drawing>
-          <wp:inline distT="0" distB="0" distL="0" distR="0" wp14:anchorId="192C9DF1" wp14:editId="5FB3DDEC">
-            <wp:extent cx="5852160" cy="3489609"/>
+          <wp:anchor distT="0" distB="0" distL="114300" distR="114300" simplePos="0" relativeHeight="251658240" behindDoc="1" locked="0" layoutInCell="1" allowOverlap="1" wp14:anchorId="5FF1C01D" wp14:editId="27EDC3D6">
+            <wp:simplePos x="0" y="0"/>
+            <wp:positionH relativeFrom="column">
+              <wp:posOffset>1066800</wp:posOffset>
+            </wp:positionH>
+            <wp:positionV relativeFrom="paragraph">
+              <wp:posOffset>7620</wp:posOffset>
+            </wp:positionV>
+            <wp:extent cx="3149600" cy="4389026"/>
             <wp:effectExtent l="0" t="0" r="0" b="0"/>
-            <wp:docPr id="1" name="Picture 1"/>
+            <wp:wrapNone/>
+            <wp:docPr id="395471373" name="Picture 1" descr="A diagram of a company&#10;&#10;Description automatically generated"/>
             <wp:cNvGraphicFramePr>
               <a:graphicFrameLocks xmlns:a="http://schemas.openxmlformats.org/drawingml/2006/main" noChangeAspect="1"/>
             </wp:cNvGraphicFramePr>
@@ -3967,31 +3872,71 @@
               <a:graphicData uri="http://schemas.openxmlformats.org/drawingml/2006/picture">
                 <pic:pic xmlns:pic="http://schemas.openxmlformats.org/drawingml/2006/picture">
                   <pic:nvPicPr>
-                    <pic:cNvPr id="0" name="use_case.png"/>
-                    <pic:cNvPicPr/>
+                    <pic:cNvPr id="395471373" name="Picture 1" descr="A diagram of a company&#10;&#10;Description automatically generated"/>
+                    <pic:cNvPicPr>
+                      <a:picLocks noChangeAspect="1" noChangeArrowheads="1"/>
+                    </pic:cNvPicPr>
                   </pic:nvPicPr>
                   <pic:blipFill>
-                    <a:blip r:embed="rId6"/>
+                    <a:blip r:embed="rId6">
+                      <a:extLst>
+                        <a:ext uri="{28A0092B-C50C-407E-A947-70E740481C1C}">
+                          <a14:useLocalDpi xmlns:a14="http://schemas.microsoft.com/office/drawing/2010/main" val="0"/>
+                        </a:ext>
+                      </a:extLst>
+                    </a:blip>
+                    <a:srcRect/>
                     <a:stretch>
                       <a:fillRect/>
                     </a:stretch>
                   </pic:blipFill>
-                  <pic:spPr>
+                  <pic:spPr bwMode="auto">
                     <a:xfrm>
                       <a:off x="0" y="0"/>
-                      <a:ext cx="5852160" cy="3489609"/>
+                      <a:ext cx="3149600" cy="4389026"/>
                     </a:xfrm>
                     <a:prstGeom prst="rect">
                       <a:avLst/>
                     </a:prstGeom>
+                    <a:noFill/>
+                    <a:ln>
+                      <a:noFill/>
+                    </a:ln>
                   </pic:spPr>
                 </pic:pic>
               </a:graphicData>
             </a:graphic>
-          </wp:inline>
+            <wp14:sizeRelH relativeFrom="page">
+              <wp14:pctWidth>0</wp14:pctWidth>
+            </wp14:sizeRelH>
+            <wp14:sizeRelV relativeFrom="page">
+              <wp14:pctHeight>0</wp14:pctHeight>
+            </wp14:sizeRelV>
+          </wp:anchor>
         </w:drawing>
       </w:r>
     </w:p>
+    <w:p>
+      <w:pPr>
+        <w:pStyle w:val="Heading1"/>
+      </w:pPr>
+    </w:p>
+    <w:p>
+      <w:pPr>
+        <w:pStyle w:val="Heading1"/>
+      </w:pPr>
+    </w:p>
+    <w:p>
+      <w:pPr>
+        <w:pStyle w:val="Heading1"/>
+      </w:pPr>
+    </w:p>
+    <w:p>
+      <w:pPr>
+        <w:pStyle w:val="Heading1"/>
+      </w:pPr>
+    </w:p>
+    <w:p/>
     <w:p>
       <w:pPr>
         <w:pStyle w:val="Heading1"/>
@@ -4461,14 +4406,7 @@
                 <w:rFonts w:ascii="Aptos" w:hAnsi="Aptos"/>
                 <w:sz w:val="17"/>
               </w:rPr>
-              <w:t xml:space="preserve">System </w:t>
-            </w:r>
-            <w:r>
-              <w:rPr>
-                <w:rFonts w:ascii="Aptos" w:hAnsi="Aptos"/>
-                <w:sz w:val="17"/>
-              </w:rPr>
-              <w:t>checks the account.</w:t>
+              <w:t>System checks the account.</w:t>
             </w:r>
           </w:p>
         </w:tc>
@@ -4973,14 +4911,7 @@
                 <w:rFonts w:ascii="Aptos" w:hAnsi="Aptos"/>
                 <w:sz w:val="17"/>
               </w:rPr>
-              <w:t xml:space="preserve">Register </w:t>
-            </w:r>
-            <w:r>
-              <w:rPr>
-                <w:rFonts w:ascii="Aptos" w:hAnsi="Aptos"/>
-                <w:sz w:val="17"/>
-              </w:rPr>
-              <w:t>Patient</w:t>
+              <w:t>Register Patient</w:t>
             </w:r>
           </w:p>
         </w:tc>
@@ -5140,14 +5071,7 @@
                 <w:rFonts w:ascii="Aptos" w:hAnsi="Aptos"/>
                 <w:sz w:val="17"/>
               </w:rPr>
-              <w:t xml:space="preserve">Receptionist is logged in and required </w:t>
-            </w:r>
-            <w:r>
-              <w:rPr>
-                <w:rFonts w:ascii="Aptos" w:hAnsi="Aptos"/>
-                <w:sz w:val="17"/>
-              </w:rPr>
-              <w:t>registration information is available.</w:t>
+              <w:t>Receptionist is logged in and required registration information is available.</w:t>
             </w:r>
           </w:p>
         </w:tc>
@@ -5278,14 +5202,7 @@
                 <w:rFonts w:ascii="Aptos" w:hAnsi="Aptos"/>
                 <w:sz w:val="17"/>
               </w:rPr>
-              <w:t xml:space="preserve">Receptionist selects </w:t>
-            </w:r>
-            <w:r>
-              <w:rPr>
-                <w:rFonts w:ascii="Aptos" w:hAnsi="Aptos"/>
-                <w:sz w:val="17"/>
-              </w:rPr>
-              <w:t>Patient Registration.</w:t>
+              <w:t>Receptionist selects Patient Registration.</w:t>
             </w:r>
           </w:p>
         </w:tc>
@@ -5583,14 +5500,7 @@
                 <w:rFonts w:ascii="Aptos" w:hAnsi="Aptos"/>
                 <w:sz w:val="17"/>
               </w:rPr>
-              <w:t xml:space="preserve">Condition / </w:t>
-            </w:r>
-            <w:r>
-              <w:rPr>
-                <w:rFonts w:ascii="Aptos" w:hAnsi="Aptos"/>
-                <w:sz w:val="17"/>
-              </w:rPr>
-              <w:t>Alternative</w:t>
+              <w:t>Condition / Alternative</w:t>
             </w:r>
           </w:p>
         </w:tc>
@@ -5730,14 +5640,7 @@
                 <w:rFonts w:ascii="Aptos" w:hAnsi="Aptos"/>
                 <w:sz w:val="17"/>
               </w:rPr>
-              <w:t xml:space="preserve">Invalid data </w:t>
-            </w:r>
-            <w:r>
-              <w:rPr>
-                <w:rFonts w:ascii="Aptos" w:hAnsi="Aptos"/>
-                <w:sz w:val="17"/>
-              </w:rPr>
-              <w:t>format</w:t>
+              <w:t>Invalid data format</w:t>
             </w:r>
           </w:p>
         </w:tc>
@@ -6219,14 +6122,7 @@
                 <w:rFonts w:ascii="Aptos" w:hAnsi="Aptos"/>
                 <w:sz w:val="17"/>
               </w:rPr>
-              <w:t xml:space="preserve">System </w:t>
-            </w:r>
-            <w:r>
-              <w:rPr>
-                <w:rFonts w:ascii="Aptos" w:hAnsi="Aptos"/>
-                <w:sz w:val="17"/>
-              </w:rPr>
-              <w:t>displays current queue order and waiting times.</w:t>
+              <w:t>System displays current queue order and waiting times.</w:t>
             </w:r>
           </w:p>
         </w:tc>
@@ -6524,14 +6420,7 @@
                 <w:rFonts w:ascii="Aptos" w:hAnsi="Aptos"/>
                 <w:sz w:val="17"/>
               </w:rPr>
-              <w:t xml:space="preserve">System highlights the patient for priority </w:t>
-            </w:r>
-            <w:r>
-              <w:rPr>
-                <w:rFonts w:ascii="Aptos" w:hAnsi="Aptos"/>
-                <w:sz w:val="17"/>
-              </w:rPr>
-              <w:t>handling.</w:t>
+              <w:t>System highlights the patient for priority handling.</w:t>
             </w:r>
           </w:p>
         </w:tc>
@@ -6899,14 +6788,7 @@
                 <w:rFonts w:ascii="Aptos" w:hAnsi="Aptos"/>
                 <w:sz w:val="17"/>
               </w:rPr>
-              <w:t xml:space="preserve">User is </w:t>
-            </w:r>
-            <w:r>
-              <w:rPr>
-                <w:rFonts w:ascii="Aptos" w:hAnsi="Aptos"/>
-                <w:sz w:val="17"/>
-              </w:rPr>
-              <w:t>authorised and patient has a stored profile.</w:t>
+              <w:t>User is authorised and patient has a stored profile.</w:t>
             </w:r>
           </w:p>
         </w:tc>
@@ -7396,14 +7278,7 @@
                 <w:rFonts w:ascii="Aptos" w:hAnsi="Aptos"/>
                 <w:sz w:val="17"/>
               </w:rPr>
-              <w:t xml:space="preserve">System </w:t>
-            </w:r>
-            <w:r>
-              <w:rPr>
-                <w:rFonts w:ascii="Aptos" w:hAnsi="Aptos"/>
-                <w:sz w:val="17"/>
-              </w:rPr>
-              <w:t>reports no match and allows another search.</w:t>
+              <w:t>System reports no match and allows another search.</w:t>
             </w:r>
           </w:p>
         </w:tc>
@@ -7740,14 +7615,7 @@
                 <w:rFonts w:ascii="Aptos" w:hAnsi="Aptos"/>
                 <w:sz w:val="17"/>
               </w:rPr>
-              <w:t xml:space="preserve">Administrator requests an </w:t>
-            </w:r>
-            <w:r>
-              <w:rPr>
-                <w:rFonts w:ascii="Aptos" w:hAnsi="Aptos"/>
-                <w:sz w:val="17"/>
-              </w:rPr>
-              <w:t>operational report.</w:t>
+              <w:t>Administrator requests an operational report.</w:t>
             </w:r>
           </w:p>
         </w:tc>
@@ -8208,14 +8076,7 @@
                 <w:rFonts w:ascii="Aptos" w:hAnsi="Aptos"/>
                 <w:sz w:val="17"/>
               </w:rPr>
-              <w:t xml:space="preserve">Condition / </w:t>
-            </w:r>
-            <w:r>
-              <w:rPr>
-                <w:rFonts w:ascii="Aptos" w:hAnsi="Aptos"/>
-                <w:sz w:val="17"/>
-              </w:rPr>
-              <w:t>Alternative</w:t>
+              <w:t>Condition / Alternative</w:t>
             </w:r>
           </w:p>
         </w:tc>
@@ -8370,14 +8231,7 @@
                 <w:rFonts w:ascii="Aptos" w:hAnsi="Aptos"/>
                 <w:sz w:val="17"/>
               </w:rPr>
-              <w:t xml:space="preserve">System denies report </w:t>
-            </w:r>
-            <w:r>
-              <w:rPr>
-                <w:rFonts w:ascii="Aptos" w:hAnsi="Aptos"/>
-                <w:sz w:val="17"/>
-              </w:rPr>
-              <w:t>access.</w:t>
+              <w:t>System denies report access.</w:t>
             </w:r>
           </w:p>
         </w:tc>
@@ -8587,14 +8441,7 @@
                 <w:rFonts w:ascii="Aptos" w:hAnsi="Aptos"/>
                 <w:sz w:val="17"/>
               </w:rPr>
-              <w:t xml:space="preserve">Create a local backup of project/system data to reduce risk of </w:t>
-            </w:r>
-            <w:r>
-              <w:rPr>
-                <w:rFonts w:ascii="Aptos" w:hAnsi="Aptos"/>
-                <w:sz w:val="17"/>
-              </w:rPr>
-              <w:t>data loss.</w:t>
+              <w:t>Create a local backup of project/system data to reduce risk of data loss.</w:t>
             </w:r>
           </w:p>
         </w:tc>
@@ -9433,10 +9280,7 @@
     </w:p>
     <w:p>
       <w:r>
-        <w:t xml:space="preserve">[INSERT ACTIVITY </w:t>
-      </w:r>
-      <w:r>
-        <w:t>DIAGRAM 3 HERE]</w:t>
+        <w:t>[INSERT ACTIVITY DIAGRAM 3 HERE]</w:t>
       </w:r>
       <w:r>
         <w:br/>
@@ -9566,14 +9410,7 @@
                 <w:rFonts w:ascii="Aptos" w:hAnsi="Aptos"/>
                 <w:sz w:val="17"/>
               </w:rPr>
-              <w:t xml:space="preserve">Registration and patient record </w:t>
-            </w:r>
-            <w:r>
-              <w:rPr>
-                <w:rFonts w:ascii="Aptos" w:hAnsi="Aptos"/>
-                <w:sz w:val="17"/>
-              </w:rPr>
-              <w:t>management</w:t>
+              <w:t>Registration and patient record management</w:t>
             </w:r>
           </w:p>
         </w:tc>
@@ -9667,14 +9504,7 @@
                 <w:rFonts w:ascii="Aptos" w:hAnsi="Aptos"/>
                 <w:sz w:val="17"/>
               </w:rPr>
-              <w:t xml:space="preserve">Visit </w:t>
-            </w:r>
-            <w:r>
-              <w:rPr>
-                <w:rFonts w:ascii="Aptos" w:hAnsi="Aptos"/>
-                <w:sz w:val="17"/>
-              </w:rPr>
-              <w:t>History</w:t>
+              <w:t>Visit History</w:t>
             </w:r>
           </w:p>
         </w:tc>
@@ -9890,14 +9720,7 @@
                 <w:rFonts w:ascii="Aptos" w:hAnsi="Aptos"/>
                 <w:sz w:val="17"/>
               </w:rPr>
-              <w:t xml:space="preserve">Data </w:t>
-            </w:r>
-            <w:r>
-              <w:rPr>
-                <w:rFonts w:ascii="Aptos" w:hAnsi="Aptos"/>
-                <w:sz w:val="17"/>
-              </w:rPr>
-              <w:t>backup</w:t>
+              <w:t>Data backup</w:t>
             </w:r>
           </w:p>
         </w:tc>
@@ -10635,10 +10458,7 @@
         <w:pStyle w:val="Heading1"/>
       </w:pPr>
       <w:r>
-        <w:t xml:space="preserve">15. UPDATED </w:t>
-      </w:r>
-      <w:r>
-        <w:t>FEATURE BACKLOG</w:t>
+        <w:t>15. UPDATED FEATURE BACKLOG</w:t>
       </w:r>
     </w:p>
     <w:tbl>
@@ -11353,19 +11173,7 @@
         <w:rPr>
           <w:sz w:val="20"/>
         </w:rPr>
-        <w:t xml:space="preserve">The analysis translates the Apex </w:t>
-      </w:r>
-      <w:r>
-        <w:rPr>
-          <w:sz w:val="20"/>
-        </w:rPr>
-        <w:t>project proposal into a structured system-analysis specification. The proposed system addresses the identified problems of manual registration, disorganised queues, long waiting times and difficult access to patient records. The defined requirements and business rules provide a basis for design, implementation and testing. The scope remains appropriate for a Year 2 academic project because it focuses on a Windows desktop application, local data storage and core patient-flow functions while excluding mobile,</w:t>
-      </w:r>
-      <w:r>
-        <w:rPr>
-          <w:sz w:val="20"/>
-        </w:rPr>
-        <w:t xml:space="preserve"> cloud and national-system integrations.</w:t>
+        <w:t>The analysis translates the Apex project proposal into a structured system-analysis specification. The proposed system addresses the identified problems of manual registration, disorganised queues, long waiting times and difficult access to patient records. The defined requirements and business rules provide a basis for design, implementation and testing. The scope remains appropriate for a Year 2 academic project because it focuses on a Windows desktop application, local data storage and core patient-flow functions while excluding mobile, cloud and national-system integrations.</w:t>
       </w:r>
     </w:p>
     <w:p/>
@@ -11534,14 +11342,7 @@
                 <w:rFonts w:ascii="Aptos" w:hAnsi="Aptos"/>
                 <w:sz w:val="17"/>
               </w:rPr>
-              <w:t xml:space="preserve">To </w:t>
-            </w:r>
-            <w:r>
-              <w:rPr>
-                <w:rFonts w:ascii="Aptos" w:hAnsi="Aptos"/>
-                <w:sz w:val="17"/>
-              </w:rPr>
-              <w:t>be confirmed</w:t>
+              <w:t>To be confirmed</w:t>
             </w:r>
           </w:p>
         </w:tc>
@@ -12001,14 +11802,7 @@
                 <w:rFonts w:ascii="Aptos" w:hAnsi="Aptos"/>
                 <w:sz w:val="17"/>
               </w:rPr>
-              <w:t xml:space="preserve">To be </w:t>
-            </w:r>
-            <w:r>
-              <w:rPr>
-                <w:rFonts w:ascii="Aptos" w:hAnsi="Aptos"/>
-                <w:sz w:val="17"/>
-              </w:rPr>
-              <w:t>confirmed</w:t>
+              <w:t>To be confirmed</w:t>
             </w:r>
           </w:p>
         </w:tc>
@@ -12207,14 +12001,7 @@
                 <w:rFonts w:ascii="Aptos" w:hAnsi="Aptos"/>
                 <w:sz w:val="17"/>
               </w:rPr>
-              <w:t xml:space="preserve">To be </w:t>
-            </w:r>
-            <w:r>
-              <w:rPr>
-                <w:rFonts w:ascii="Aptos" w:hAnsi="Aptos"/>
-                <w:sz w:val="17"/>
-              </w:rPr>
-              <w:t>confirmed</w:t>
+              <w:t>To be confirmed</w:t>
             </w:r>
           </w:p>
         </w:tc>

</xml_diff>

<commit_message>
Updated System Analysis and Also template for System Analysis added to the doc folder
</commit_message>
<xml_diff>
--- a/docs/System Analysis/Apex Systems System Analysis Filled.docx
+++ b/docs/System Analysis/Apex Systems System Analysis Filled.docx
@@ -240,12 +240,18 @@
             <w:vAlign w:val="center"/>
           </w:tcPr>
           <w:p>
-            <w:r>
-              <w:rPr>
-                <w:rFonts w:ascii="Aptos" w:hAnsi="Aptos"/>
-                <w:sz w:val="17"/>
-              </w:rPr>
-              <w:t>To be confirmed</w:t>
+            <w:pPr>
+              <w:rPr>
+                <w:sz w:val="17"/>
+                <w:szCs w:val="17"/>
+              </w:rPr>
+            </w:pPr>
+            <w:r>
+              <w:rPr>
+                <w:sz w:val="17"/>
+                <w:szCs w:val="17"/>
+              </w:rPr>
+              <w:t>04/09/2026</w:t>
             </w:r>
           </w:p>
         </w:tc>
@@ -867,12 +873,13 @@
     <w:p>
       <w:r>
         <w:lastRenderedPageBreak/>
-        <w:t>The project proposal does not record formal lecturer feedback. The analysis therefore converts the proposal into a more detailed system-analysis specification, including a defined scope, stakeholders, actors, requirements, business rules, use cases, data requirements and traceability. The solution is explicitly treated as a Windows desktop, offline system rather than an online/cloud application.</w:t>
+        <w:t xml:space="preserve">The project proposal </w:t>
       </w:r>
-    </w:p>
-    <w:p>
       <w:r>
-        <w:t>If the original proposal described the solution as an online/web application, explain any revision made to comply with the Integrated Project requirements.</w:t>
+        <w:t xml:space="preserve">did not receive negative </w:t>
+      </w:r>
+      <w:r>
+        <w:t>feedback. The analysis therefore converts the proposal into a more detailed system-analysis specification, including a defined scope, stakeholders, actors, requirements, business rules, use cases, data requirements and traceability. The solution is explicitly treated as a Windows desktop, offline system rather than an online/cloud application.</w:t>
       </w:r>
     </w:p>
     <w:p>
@@ -886,9 +893,17 @@
     <w:p>
       <w:pPr>
         <w:pStyle w:val="Heading2"/>
+        <w:rPr>
+          <w:b w:val="0"/>
+          <w:bCs w:val="0"/>
+          <w:color w:val="auto"/>
+        </w:rPr>
       </w:pPr>
       <w:r>
         <w:rPr>
+          <w:b w:val="0"/>
+          <w:bCs w:val="0"/>
+          <w:color w:val="auto"/>
           <w:sz w:val="20"/>
         </w:rPr>
         <w:t>Public healthcare facilities can experience disorganised queues, excessive waiting times, lost or incomplete paper files, slow retrieval of patient history and repeated capture of information. These problems increase administrative workload and can delay access to information needed for patient care. Apex addresses the problem by providing structured queue management and accessible digital patient records.</w:t>
@@ -898,12 +913,377 @@
     <w:p>
       <w:pPr>
         <w:pStyle w:val="Heading2"/>
+        <w:rPr>
+          <w:color w:val="auto"/>
+          <w:sz w:val="20"/>
+        </w:rPr>
       </w:pPr>
       <w:r>
         <w:rPr>
+          <w:color w:val="auto"/>
           <w:sz w:val="20"/>
         </w:rPr>
-        <w:t>Current process: (1) patient arrives; (2) receptionist captures or checks information using paper forms/registers; (3) a physical file is located or created; (4) patient waits while the queue is managed manually; (5) staff call patients without a central queue dashboard; (6) nurse/clinician retrieves the physical record and provides service; (7) visit information is recorded in the file; (8) the file is stored again. The proposal identifies slow access, lost files, inconsistent records and lack of reporting as limitations.</w:t>
+        <w:t xml:space="preserve">Current process: </w:t>
+      </w:r>
+    </w:p>
+    <w:p>
+      <w:pPr>
+        <w:pStyle w:val="Heading2"/>
+        <w:numPr>
+          <w:ilvl w:val="0"/>
+          <w:numId w:val="10"/>
+        </w:numPr>
+        <w:rPr>
+          <w:color w:val="auto"/>
+          <w:sz w:val="20"/>
+        </w:rPr>
+      </w:pPr>
+      <w:r>
+        <w:rPr>
+          <w:color w:val="auto"/>
+          <w:sz w:val="20"/>
+        </w:rPr>
+        <w:t xml:space="preserve"> </w:t>
+      </w:r>
+      <w:r>
+        <w:rPr>
+          <w:color w:val="auto"/>
+          <w:sz w:val="20"/>
+        </w:rPr>
+        <w:t>P</w:t>
+      </w:r>
+      <w:r>
+        <w:rPr>
+          <w:color w:val="auto"/>
+          <w:sz w:val="20"/>
+        </w:rPr>
+        <w:t xml:space="preserve">atient </w:t>
+      </w:r>
+      <w:proofErr w:type="gramStart"/>
+      <w:r>
+        <w:rPr>
+          <w:color w:val="auto"/>
+          <w:sz w:val="20"/>
+        </w:rPr>
+        <w:t>arrives</w:t>
+      </w:r>
+      <w:proofErr w:type="gramEnd"/>
+      <w:r>
+        <w:rPr>
+          <w:color w:val="auto"/>
+          <w:sz w:val="20"/>
+        </w:rPr>
+        <w:t xml:space="preserve"> </w:t>
+      </w:r>
+    </w:p>
+    <w:p>
+      <w:pPr>
+        <w:pStyle w:val="Heading2"/>
+        <w:numPr>
+          <w:ilvl w:val="0"/>
+          <w:numId w:val="10"/>
+        </w:numPr>
+        <w:rPr>
+          <w:color w:val="auto"/>
+          <w:sz w:val="20"/>
+        </w:rPr>
+      </w:pPr>
+      <w:r>
+        <w:rPr>
+          <w:color w:val="auto"/>
+          <w:sz w:val="20"/>
+        </w:rPr>
+        <w:t>R</w:t>
+      </w:r>
+      <w:r>
+        <w:rPr>
+          <w:color w:val="auto"/>
+          <w:sz w:val="20"/>
+        </w:rPr>
+        <w:t>eceptionist captures or checks information using paper forms/</w:t>
+      </w:r>
+      <w:proofErr w:type="gramStart"/>
+      <w:r>
+        <w:rPr>
+          <w:color w:val="auto"/>
+          <w:sz w:val="20"/>
+        </w:rPr>
+        <w:t>registers;</w:t>
+      </w:r>
+      <w:proofErr w:type="gramEnd"/>
+    </w:p>
+    <w:p>
+      <w:pPr>
+        <w:pStyle w:val="Heading2"/>
+        <w:numPr>
+          <w:ilvl w:val="0"/>
+          <w:numId w:val="10"/>
+        </w:numPr>
+        <w:rPr>
+          <w:color w:val="auto"/>
+          <w:sz w:val="20"/>
+        </w:rPr>
+      </w:pPr>
+      <w:r>
+        <w:rPr>
+          <w:color w:val="auto"/>
+          <w:sz w:val="20"/>
+        </w:rPr>
+        <w:t>P</w:t>
+      </w:r>
+      <w:r>
+        <w:rPr>
+          <w:color w:val="auto"/>
+          <w:sz w:val="20"/>
+        </w:rPr>
+        <w:t xml:space="preserve">hysical file is located or </w:t>
+      </w:r>
+      <w:proofErr w:type="gramStart"/>
+      <w:r>
+        <w:rPr>
+          <w:color w:val="auto"/>
+          <w:sz w:val="20"/>
+        </w:rPr>
+        <w:t>created;</w:t>
+      </w:r>
+      <w:proofErr w:type="gramEnd"/>
+      <w:r>
+        <w:rPr>
+          <w:color w:val="auto"/>
+          <w:sz w:val="20"/>
+        </w:rPr>
+        <w:t xml:space="preserve"> </w:t>
+      </w:r>
+    </w:p>
+    <w:p>
+      <w:pPr>
+        <w:pStyle w:val="Heading2"/>
+        <w:numPr>
+          <w:ilvl w:val="0"/>
+          <w:numId w:val="10"/>
+        </w:numPr>
+        <w:rPr>
+          <w:color w:val="auto"/>
+          <w:sz w:val="20"/>
+        </w:rPr>
+      </w:pPr>
+      <w:r>
+        <w:rPr>
+          <w:color w:val="auto"/>
+          <w:sz w:val="20"/>
+        </w:rPr>
+        <w:t>P</w:t>
+      </w:r>
+      <w:r>
+        <w:rPr>
+          <w:color w:val="auto"/>
+          <w:sz w:val="20"/>
+        </w:rPr>
+        <w:t xml:space="preserve">atient waits while the queue is managed </w:t>
+      </w:r>
+      <w:proofErr w:type="gramStart"/>
+      <w:r>
+        <w:rPr>
+          <w:color w:val="auto"/>
+          <w:sz w:val="20"/>
+        </w:rPr>
+        <w:t>manually;</w:t>
+      </w:r>
+      <w:proofErr w:type="gramEnd"/>
+      <w:r>
+        <w:rPr>
+          <w:color w:val="auto"/>
+          <w:sz w:val="20"/>
+        </w:rPr>
+        <w:t xml:space="preserve"> </w:t>
+      </w:r>
+    </w:p>
+    <w:p>
+      <w:pPr>
+        <w:pStyle w:val="Heading2"/>
+        <w:numPr>
+          <w:ilvl w:val="0"/>
+          <w:numId w:val="10"/>
+        </w:numPr>
+        <w:rPr>
+          <w:color w:val="auto"/>
+          <w:sz w:val="20"/>
+        </w:rPr>
+      </w:pPr>
+      <w:r>
+        <w:rPr>
+          <w:color w:val="auto"/>
+          <w:sz w:val="20"/>
+        </w:rPr>
+        <w:t>S</w:t>
+      </w:r>
+      <w:r>
+        <w:rPr>
+          <w:color w:val="auto"/>
+          <w:sz w:val="20"/>
+        </w:rPr>
+        <w:t xml:space="preserve">taff call patients without a central queue </w:t>
+      </w:r>
+      <w:proofErr w:type="gramStart"/>
+      <w:r>
+        <w:rPr>
+          <w:color w:val="auto"/>
+          <w:sz w:val="20"/>
+        </w:rPr>
+        <w:t>dashboard;</w:t>
+      </w:r>
+      <w:proofErr w:type="gramEnd"/>
+      <w:r>
+        <w:rPr>
+          <w:color w:val="auto"/>
+          <w:sz w:val="20"/>
+        </w:rPr>
+        <w:t xml:space="preserve"> </w:t>
+      </w:r>
+    </w:p>
+    <w:p>
+      <w:pPr>
+        <w:pStyle w:val="Heading2"/>
+        <w:numPr>
+          <w:ilvl w:val="0"/>
+          <w:numId w:val="10"/>
+        </w:numPr>
+        <w:rPr>
+          <w:color w:val="auto"/>
+          <w:sz w:val="20"/>
+        </w:rPr>
+      </w:pPr>
+      <w:r>
+        <w:rPr>
+          <w:color w:val="auto"/>
+          <w:sz w:val="20"/>
+        </w:rPr>
+        <w:t>N</w:t>
+      </w:r>
+      <w:r>
+        <w:rPr>
+          <w:color w:val="auto"/>
+          <w:sz w:val="20"/>
+        </w:rPr>
+        <w:t xml:space="preserve">urse/clinician retrieves the physical record and provides </w:t>
+      </w:r>
+      <w:proofErr w:type="gramStart"/>
+      <w:r>
+        <w:rPr>
+          <w:color w:val="auto"/>
+          <w:sz w:val="20"/>
+        </w:rPr>
+        <w:t>service;</w:t>
+      </w:r>
+      <w:proofErr w:type="gramEnd"/>
+      <w:r>
+        <w:rPr>
+          <w:color w:val="auto"/>
+          <w:sz w:val="20"/>
+        </w:rPr>
+        <w:t xml:space="preserve"> </w:t>
+      </w:r>
+    </w:p>
+    <w:p>
+      <w:pPr>
+        <w:pStyle w:val="Heading2"/>
+        <w:numPr>
+          <w:ilvl w:val="0"/>
+          <w:numId w:val="10"/>
+        </w:numPr>
+        <w:rPr>
+          <w:color w:val="auto"/>
+          <w:sz w:val="20"/>
+        </w:rPr>
+      </w:pPr>
+      <w:r>
+        <w:rPr>
+          <w:color w:val="auto"/>
+          <w:sz w:val="20"/>
+        </w:rPr>
+        <w:t>V</w:t>
+      </w:r>
+      <w:r>
+        <w:rPr>
+          <w:color w:val="auto"/>
+          <w:sz w:val="20"/>
+        </w:rPr>
+        <w:t xml:space="preserve">isit information is recorded in the </w:t>
+      </w:r>
+      <w:proofErr w:type="gramStart"/>
+      <w:r>
+        <w:rPr>
+          <w:color w:val="auto"/>
+          <w:sz w:val="20"/>
+        </w:rPr>
+        <w:t>file;</w:t>
+      </w:r>
+      <w:proofErr w:type="gramEnd"/>
+      <w:r>
+        <w:rPr>
+          <w:color w:val="auto"/>
+          <w:sz w:val="20"/>
+        </w:rPr>
+        <w:t xml:space="preserve"> </w:t>
+      </w:r>
+    </w:p>
+    <w:p>
+      <w:pPr>
+        <w:pStyle w:val="Heading2"/>
+        <w:numPr>
+          <w:ilvl w:val="0"/>
+          <w:numId w:val="10"/>
+        </w:numPr>
+        <w:rPr>
+          <w:color w:val="auto"/>
+          <w:sz w:val="20"/>
+        </w:rPr>
+      </w:pPr>
+      <w:r>
+        <w:rPr>
+          <w:color w:val="auto"/>
+          <w:sz w:val="20"/>
+        </w:rPr>
+        <w:t>T</w:t>
+      </w:r>
+      <w:r>
+        <w:rPr>
+          <w:color w:val="auto"/>
+          <w:sz w:val="20"/>
+        </w:rPr>
+        <w:t xml:space="preserve">he file is stored again. </w:t>
+      </w:r>
+    </w:p>
+    <w:p>
+      <w:pPr>
+        <w:pStyle w:val="Heading2"/>
+        <w:rPr>
+          <w:color w:val="auto"/>
+          <w:sz w:val="20"/>
+        </w:rPr>
+      </w:pPr>
+      <w:r>
+        <w:rPr>
+          <w:color w:val="auto"/>
+          <w:sz w:val="20"/>
+        </w:rPr>
+        <w:t xml:space="preserve">The proposal identifies slow access, lost files, inconsistent </w:t>
+      </w:r>
+      <w:proofErr w:type="gramStart"/>
+      <w:r>
+        <w:rPr>
+          <w:color w:val="auto"/>
+          <w:sz w:val="20"/>
+        </w:rPr>
+        <w:t>records</w:t>
+      </w:r>
+      <w:proofErr w:type="gramEnd"/>
+      <w:r>
+        <w:rPr>
+          <w:color w:val="auto"/>
+          <w:sz w:val="20"/>
+        </w:rPr>
+        <w:t xml:space="preserve"> and lack of reporting as limitations.</w:t>
       </w:r>
     </w:p>
     <w:p/>
@@ -1178,6 +1558,7 @@
                 <w:rFonts w:ascii="Aptos" w:hAnsi="Aptos"/>
                 <w:sz w:val="17"/>
               </w:rPr>
+              <w:lastRenderedPageBreak/>
               <w:t>5</w:t>
             </w:r>
           </w:p>
@@ -1290,7 +1671,6 @@
                 <w:rFonts w:ascii="Aptos" w:hAnsi="Aptos"/>
                 <w:sz w:val="17"/>
               </w:rPr>
-              <w:lastRenderedPageBreak/>
               <w:t>1</w:t>
             </w:r>
           </w:p>
@@ -1421,18 +1801,6 @@
         </w:tc>
       </w:tr>
     </w:tbl>
-    <w:p/>
-    <w:p>
-      <w:pPr>
-        <w:pStyle w:val="Heading2"/>
-      </w:pPr>
-      <w:r>
-        <w:rPr>
-          <w:sz w:val="20"/>
-        </w:rPr>
-        <w:t>System boundary: Apex covers local patient registration, queue assignment and monitoring, priority/emergency flagging, digital record search and updates, visit history, basic operational reporting and local backup. External systems, internet/cloud services, mobile applications and national health database integrations are outside the boundary. The system is intended to operate on a local Windows environment with a local database.</w:t>
-      </w:r>
-    </w:p>
     <w:p/>
     <w:p>
       <w:pPr>
@@ -3826,9 +4194,25 @@
     </w:p>
     <w:p>
       <w:pPr>
+        <w:rPr>
+          <w:rFonts w:asciiTheme="majorHAnsi" w:eastAsiaTheme="majorEastAsia" w:hAnsiTheme="majorHAnsi" w:cstheme="majorBidi"/>
+          <w:b/>
+          <w:bCs/>
+          <w:color w:val="365F91" w:themeColor="accent1" w:themeShade="BF"/>
+          <w:sz w:val="28"/>
+          <w:szCs w:val="28"/>
+        </w:rPr>
+      </w:pPr>
+      <w:r>
+        <w:br w:type="page"/>
+      </w:r>
+    </w:p>
+    <w:p>
+      <w:pPr>
         <w:pStyle w:val="Heading1"/>
       </w:pPr>
       <w:r>
+        <w:lastRenderedPageBreak/>
         <w:t>10. USE CASE DIAGRAM</w:t>
       </w:r>
     </w:p>
@@ -3853,16 +4237,16 @@
           <w:noProof/>
         </w:rPr>
         <w:drawing>
-          <wp:anchor distT="0" distB="0" distL="114300" distR="114300" simplePos="0" relativeHeight="251658240" behindDoc="1" locked="0" layoutInCell="1" allowOverlap="1" wp14:anchorId="5FF1C01D" wp14:editId="27EDC3D6">
+          <wp:anchor distT="0" distB="0" distL="114300" distR="114300" simplePos="0" relativeHeight="251658240" behindDoc="1" locked="0" layoutInCell="1" allowOverlap="1" wp14:anchorId="5FF1C01D" wp14:editId="05C3F256">
             <wp:simplePos x="0" y="0"/>
-            <wp:positionH relativeFrom="column">
-              <wp:posOffset>1066800</wp:posOffset>
+            <wp:positionH relativeFrom="margin">
+              <wp:align>right</wp:align>
             </wp:positionH>
             <wp:positionV relativeFrom="paragraph">
-              <wp:posOffset>7620</wp:posOffset>
+              <wp:posOffset>82550</wp:posOffset>
             </wp:positionV>
-            <wp:extent cx="3149600" cy="4389026"/>
-            <wp:effectExtent l="0" t="0" r="0" b="0"/>
+            <wp:extent cx="5298013" cy="7383780"/>
+            <wp:effectExtent l="0" t="0" r="0" b="7620"/>
             <wp:wrapNone/>
             <wp:docPr id="395471373" name="Picture 1" descr="A diagram of a company&#10;&#10;Description automatically generated"/>
             <wp:cNvGraphicFramePr>
@@ -3893,7 +4277,7 @@
                   <pic:spPr bwMode="auto">
                     <a:xfrm>
                       <a:off x="0" y="0"/>
-                      <a:ext cx="3149600" cy="4389026"/>
+                      <a:ext cx="5298013" cy="7383780"/>
                     </a:xfrm>
                     <a:prstGeom prst="rect">
                       <a:avLst/>
@@ -3939,6 +4323,21 @@
     <w:p/>
     <w:p>
       <w:pPr>
+        <w:rPr>
+          <w:rFonts w:asciiTheme="majorHAnsi" w:eastAsiaTheme="majorEastAsia" w:hAnsiTheme="majorHAnsi" w:cstheme="majorBidi"/>
+          <w:b/>
+          <w:bCs/>
+          <w:color w:val="365F91" w:themeColor="accent1" w:themeShade="BF"/>
+          <w:sz w:val="28"/>
+          <w:szCs w:val="28"/>
+        </w:rPr>
+      </w:pPr>
+      <w:r>
+        <w:br w:type="page"/>
+      </w:r>
+    </w:p>
+    <w:p>
+      <w:pPr>
         <w:pStyle w:val="Heading1"/>
       </w:pPr>
       <w:r>
@@ -9101,6 +9500,36 @@
     <w:p/>
     <w:p>
       <w:pPr>
+        <w:rPr>
+          <w:b/>
+        </w:rPr>
+      </w:pPr>
+      <w:r>
+        <w:rPr>
+          <w:b/>
+        </w:rPr>
+        <w:br w:type="page"/>
+      </w:r>
+    </w:p>
+    <w:p>
+      <w:pPr>
+        <w:pStyle w:val="Heading1"/>
+      </w:pPr>
+      <w:r>
+        <w:lastRenderedPageBreak/>
+        <w:t>12. ACTIVITY DIAGRAMS</w:t>
+      </w:r>
+    </w:p>
+    <w:p>
+      <w:pPr>
+        <w:jc w:val="center"/>
+        <w:rPr>
+          <w:b/>
+        </w:rPr>
+      </w:pPr>
+    </w:p>
+    <w:p>
+      <w:pPr>
         <w:jc w:val="center"/>
       </w:pPr>
       <w:r>
@@ -9118,7 +9547,6 @@
         <w:rPr>
           <w:noProof/>
         </w:rPr>
-        <w:lastRenderedPageBreak/>
         <w:drawing>
           <wp:inline distT="0" distB="0" distL="0" distR="0" wp14:anchorId="1255897E" wp14:editId="768869AE">
             <wp:extent cx="5852160" cy="5852160"/>
@@ -9250,43 +9678,17 @@
     </w:p>
     <w:p>
       <w:pPr>
-        <w:pStyle w:val="Heading1"/>
+        <w:rPr>
+          <w:rFonts w:asciiTheme="majorHAnsi" w:eastAsiaTheme="majorEastAsia" w:hAnsiTheme="majorHAnsi" w:cstheme="majorBidi"/>
+          <w:b/>
+          <w:bCs/>
+          <w:color w:val="365F91" w:themeColor="accent1" w:themeShade="BF"/>
+          <w:sz w:val="28"/>
+          <w:szCs w:val="28"/>
+        </w:rPr>
       </w:pPr>
       <w:r>
-        <w:t>12. ACTIVITY DIAGRAMS</w:t>
-      </w:r>
-    </w:p>
-    <w:p>
-      <w:r>
-        <w:t>[INSERT ACTIVITY DIAGRAM 1 HERE]</w:t>
-      </w:r>
-      <w:r>
-        <w:br/>
-      </w:r>
-      <w:r>
-        <w:br/>
-      </w:r>
-    </w:p>
-    <w:p>
-      <w:r>
-        <w:t>[INSERT ACTIVITY DIAGRAM 2 HERE]</w:t>
-      </w:r>
-      <w:r>
-        <w:br/>
-      </w:r>
-      <w:r>
-        <w:br/>
-      </w:r>
-    </w:p>
-    <w:p>
-      <w:r>
-        <w:t>[INSERT ACTIVITY DIAGRAM 3 HERE]</w:t>
-      </w:r>
-      <w:r>
-        <w:br/>
-      </w:r>
-      <w:r>
-        <w:br/>
+        <w:br w:type="page"/>
       </w:r>
     </w:p>
     <w:p>
@@ -10455,9 +10857,25 @@
     <w:p/>
     <w:p>
       <w:pPr>
+        <w:rPr>
+          <w:rFonts w:asciiTheme="majorHAnsi" w:eastAsiaTheme="majorEastAsia" w:hAnsiTheme="majorHAnsi" w:cstheme="majorBidi"/>
+          <w:b/>
+          <w:bCs/>
+          <w:color w:val="365F91" w:themeColor="accent1" w:themeShade="BF"/>
+          <w:sz w:val="28"/>
+          <w:szCs w:val="28"/>
+        </w:rPr>
+      </w:pPr>
+      <w:r>
+        <w:br w:type="page"/>
+      </w:r>
+    </w:p>
+    <w:p>
+      <w:pPr>
         <w:pStyle w:val="Heading1"/>
       </w:pPr>
       <w:r>
+        <w:lastRenderedPageBreak/>
         <w:t>15. UPDATED FEATURE BACKLOG</w:t>
       </w:r>
     </w:p>
@@ -10635,7 +11053,6 @@
                 <w:rFonts w:ascii="Aptos" w:hAnsi="Aptos"/>
                 <w:sz w:val="17"/>
               </w:rPr>
-              <w:lastRenderedPageBreak/>
               <w:t>F02</w:t>
             </w:r>
           </w:p>
@@ -11165,17 +11582,6 @@
       </w:tr>
     </w:tbl>
     <w:p/>
-    <w:p>
-      <w:pPr>
-        <w:pStyle w:val="Heading1"/>
-      </w:pPr>
-      <w:r>
-        <w:rPr>
-          <w:sz w:val="20"/>
-        </w:rPr>
-        <w:t>The analysis translates the Apex project proposal into a structured system-analysis specification. The proposed system addresses the identified problems of manual registration, disorganised queues, long waiting times and difficult access to patient records. The defined requirements and business rules provide a basis for design, implementation and testing. The scope remains appropriate for a Year 2 academic project because it focuses on a Windows desktop application, local data storage and core patient-flow functions while excluding mobile, cloud and national-system integrations.</w:t>
-      </w:r>
-    </w:p>
     <w:p/>
     <w:p>
       <w:pPr>
@@ -12206,6 +12612,118 @@
       </w:rPr>
     </w:lvl>
   </w:abstractNum>
+  <w:abstractNum w:abstractNumId="9" w15:restartNumberingAfterBreak="0">
+    <w:nsid w:val="44860FFF"/>
+    <w:multiLevelType w:val="hybridMultilevel"/>
+    <w:tmpl w:val="695099A2"/>
+    <w:lvl w:ilvl="0" w:tplc="E5B4CD4C">
+      <w:numFmt w:val="bullet"/>
+      <w:lvlText w:val="-"/>
+      <w:lvlJc w:val="left"/>
+      <w:pPr>
+        <w:ind w:left="720" w:hanging="360"/>
+      </w:pPr>
+      <w:rPr>
+        <w:rFonts w:ascii="Calibri" w:eastAsiaTheme="majorEastAsia" w:hAnsi="Calibri" w:cs="Calibri" w:hint="default"/>
+      </w:rPr>
+    </w:lvl>
+    <w:lvl w:ilvl="1" w:tplc="1C090003" w:tentative="1">
+      <w:start w:val="1"/>
+      <w:numFmt w:val="bullet"/>
+      <w:lvlText w:val="o"/>
+      <w:lvlJc w:val="left"/>
+      <w:pPr>
+        <w:ind w:left="1440" w:hanging="360"/>
+      </w:pPr>
+      <w:rPr>
+        <w:rFonts w:ascii="Courier New" w:hAnsi="Courier New" w:cs="Courier New" w:hint="default"/>
+      </w:rPr>
+    </w:lvl>
+    <w:lvl w:ilvl="2" w:tplc="1C090005" w:tentative="1">
+      <w:start w:val="1"/>
+      <w:numFmt w:val="bullet"/>
+      <w:lvlText w:val=""/>
+      <w:lvlJc w:val="left"/>
+      <w:pPr>
+        <w:ind w:left="2160" w:hanging="360"/>
+      </w:pPr>
+      <w:rPr>
+        <w:rFonts w:ascii="Wingdings" w:hAnsi="Wingdings" w:hint="default"/>
+      </w:rPr>
+    </w:lvl>
+    <w:lvl w:ilvl="3" w:tplc="1C090001" w:tentative="1">
+      <w:start w:val="1"/>
+      <w:numFmt w:val="bullet"/>
+      <w:lvlText w:val=""/>
+      <w:lvlJc w:val="left"/>
+      <w:pPr>
+        <w:ind w:left="2880" w:hanging="360"/>
+      </w:pPr>
+      <w:rPr>
+        <w:rFonts w:ascii="Symbol" w:hAnsi="Symbol" w:hint="default"/>
+      </w:rPr>
+    </w:lvl>
+    <w:lvl w:ilvl="4" w:tplc="1C090003" w:tentative="1">
+      <w:start w:val="1"/>
+      <w:numFmt w:val="bullet"/>
+      <w:lvlText w:val="o"/>
+      <w:lvlJc w:val="left"/>
+      <w:pPr>
+        <w:ind w:left="3600" w:hanging="360"/>
+      </w:pPr>
+      <w:rPr>
+        <w:rFonts w:ascii="Courier New" w:hAnsi="Courier New" w:cs="Courier New" w:hint="default"/>
+      </w:rPr>
+    </w:lvl>
+    <w:lvl w:ilvl="5" w:tplc="1C090005" w:tentative="1">
+      <w:start w:val="1"/>
+      <w:numFmt w:val="bullet"/>
+      <w:lvlText w:val=""/>
+      <w:lvlJc w:val="left"/>
+      <w:pPr>
+        <w:ind w:left="4320" w:hanging="360"/>
+      </w:pPr>
+      <w:rPr>
+        <w:rFonts w:ascii="Wingdings" w:hAnsi="Wingdings" w:hint="default"/>
+      </w:rPr>
+    </w:lvl>
+    <w:lvl w:ilvl="6" w:tplc="1C090001" w:tentative="1">
+      <w:start w:val="1"/>
+      <w:numFmt w:val="bullet"/>
+      <w:lvlText w:val=""/>
+      <w:lvlJc w:val="left"/>
+      <w:pPr>
+        <w:ind w:left="5040" w:hanging="360"/>
+      </w:pPr>
+      <w:rPr>
+        <w:rFonts w:ascii="Symbol" w:hAnsi="Symbol" w:hint="default"/>
+      </w:rPr>
+    </w:lvl>
+    <w:lvl w:ilvl="7" w:tplc="1C090003" w:tentative="1">
+      <w:start w:val="1"/>
+      <w:numFmt w:val="bullet"/>
+      <w:lvlText w:val="o"/>
+      <w:lvlJc w:val="left"/>
+      <w:pPr>
+        <w:ind w:left="5760" w:hanging="360"/>
+      </w:pPr>
+      <w:rPr>
+        <w:rFonts w:ascii="Courier New" w:hAnsi="Courier New" w:cs="Courier New" w:hint="default"/>
+      </w:rPr>
+    </w:lvl>
+    <w:lvl w:ilvl="8" w:tplc="1C090005" w:tentative="1">
+      <w:start w:val="1"/>
+      <w:numFmt w:val="bullet"/>
+      <w:lvlText w:val=""/>
+      <w:lvlJc w:val="left"/>
+      <w:pPr>
+        <w:ind w:left="6480" w:hanging="360"/>
+      </w:pPr>
+      <w:rPr>
+        <w:rFonts w:ascii="Wingdings" w:hAnsi="Wingdings" w:hint="default"/>
+      </w:rPr>
+    </w:lvl>
+  </w:abstractNum>
   <w:num w:numId="1" w16cid:durableId="1318073483">
     <w:abstractNumId w:val="8"/>
   </w:num>
@@ -12232,6 +12750,9 @@
   </w:num>
   <w:num w:numId="9" w16cid:durableId="1444883400">
     <w:abstractNumId w:val="0"/>
+  </w:num>
+  <w:num w:numId="10" w16cid:durableId="642200855">
+    <w:abstractNumId w:val="9"/>
   </w:num>
 </w:numbering>
 </file>

</xml_diff>